<commit_message>
Update AI usage report
</commit_message>
<xml_diff>
--- a/AI Usage Report.docx
+++ b/AI Usage Report.docx
@@ -6,14 +6,16 @@
       <w:pPr>
         <w:spacing w:after="0"/>
         <w:rPr>
-          <w:b/>
-          <w:bCs/>
-          <w:sz w:val="18"/>
-          <w:szCs w:val="18"/>
-        </w:rPr>
-      </w:pPr>
-      <w:r>
-        <w:rPr>
+          <w:rFonts w:hint="default" w:ascii="Arial" w:hAnsi="Arial" w:cs="Arial"/>
+          <w:b/>
+          <w:bCs/>
+          <w:sz w:val="18"/>
+          <w:szCs w:val="18"/>
+        </w:rPr>
+      </w:pPr>
+      <w:r>
+        <w:rPr>
+          <w:rFonts w:hint="default" w:ascii="Arial" w:hAnsi="Arial" w:cs="Arial"/>
           <w:b/>
           <w:bCs/>
           <w:sz w:val="18"/>
@@ -26,7 +28,7 @@
       <w:pPr>
         <w:spacing w:after="0"/>
         <w:rPr>
-          <w:rFonts w:hint="default"/>
+          <w:rFonts w:hint="default" w:ascii="Arial" w:hAnsi="Arial" w:cs="Arial"/>
           <w:sz w:val="18"/>
           <w:szCs w:val="18"/>
           <w:lang w:val="en-US"/>
@@ -34,6 +36,7 @@
       </w:pPr>
       <w:r>
         <w:rPr>
+          <w:rFonts w:hint="default" w:ascii="Arial" w:hAnsi="Arial" w:cs="Arial"/>
           <w:b/>
           <w:bCs/>
           <w:sz w:val="18"/>
@@ -43,6 +46,7 @@
       </w:r>
       <w:r>
         <w:rPr>
+          <w:rFonts w:hint="default" w:ascii="Arial" w:hAnsi="Arial" w:cs="Arial"/>
           <w:sz w:val="18"/>
           <w:szCs w:val="18"/>
         </w:rPr>
@@ -50,7 +54,7 @@
       </w:r>
       <w:r>
         <w:rPr>
-          <w:rFonts w:hint="default"/>
+          <w:rFonts w:hint="default" w:ascii="Arial" w:hAnsi="Arial" w:cs="Arial"/>
           <w:sz w:val="18"/>
           <w:szCs w:val="18"/>
           <w:lang w:val="en-US"/>
@@ -59,6 +63,7 @@
       </w:r>
       <w:r>
         <w:rPr>
+          <w:rFonts w:hint="default" w:ascii="Arial" w:hAnsi="Arial" w:cs="Arial"/>
           <w:sz w:val="18"/>
           <w:szCs w:val="18"/>
         </w:rPr>
@@ -66,6 +71,7 @@
       </w:r>
       <w:r>
         <w:rPr>
+          <w:rFonts w:hint="default" w:ascii="Arial" w:hAnsi="Arial" w:cs="Arial"/>
           <w:b/>
           <w:bCs/>
           <w:sz w:val="18"/>
@@ -75,6 +81,7 @@
       </w:r>
       <w:r>
         <w:rPr>
+          <w:rFonts w:hint="default" w:ascii="Arial" w:hAnsi="Arial" w:cs="Arial"/>
           <w:sz w:val="18"/>
           <w:szCs w:val="18"/>
         </w:rPr>
@@ -82,7 +89,7 @@
       </w:r>
       <w:r>
         <w:rPr>
-          <w:rFonts w:hint="default"/>
+          <w:rFonts w:hint="default" w:ascii="Arial" w:hAnsi="Arial" w:cs="Arial"/>
           <w:sz w:val="18"/>
           <w:szCs w:val="18"/>
           <w:lang w:val="en-US"/>
@@ -91,6 +98,7 @@
       </w:r>
       <w:r>
         <w:rPr>
+          <w:rFonts w:hint="default" w:ascii="Arial" w:hAnsi="Arial" w:cs="Arial"/>
           <w:sz w:val="18"/>
           <w:szCs w:val="18"/>
         </w:rPr>
@@ -98,6 +106,7 @@
       </w:r>
       <w:r>
         <w:rPr>
+          <w:rFonts w:hint="default" w:ascii="Arial" w:hAnsi="Arial" w:cs="Arial"/>
           <w:b/>
           <w:bCs/>
           <w:sz w:val="18"/>
@@ -107,6 +116,7 @@
       </w:r>
       <w:r>
         <w:rPr>
+          <w:rFonts w:hint="default" w:ascii="Arial" w:hAnsi="Arial" w:cs="Arial"/>
           <w:sz w:val="18"/>
           <w:szCs w:val="18"/>
         </w:rPr>
@@ -114,7 +124,7 @@
       </w:r>
       <w:r>
         <w:rPr>
-          <w:rFonts w:hint="default"/>
+          <w:rFonts w:hint="default" w:ascii="Arial" w:hAnsi="Arial" w:cs="Arial"/>
           <w:sz w:val="18"/>
           <w:szCs w:val="18"/>
           <w:lang w:val="en-US"/>
@@ -123,6 +133,7 @@
       </w:r>
       <w:r>
         <w:rPr>
+          <w:rFonts w:hint="default" w:ascii="Arial" w:hAnsi="Arial" w:cs="Arial"/>
           <w:sz w:val="18"/>
           <w:szCs w:val="18"/>
         </w:rPr>
@@ -130,6 +141,7 @@
       </w:r>
       <w:r>
         <w:rPr>
+          <w:rFonts w:hint="default" w:ascii="Arial" w:hAnsi="Arial" w:cs="Arial"/>
           <w:b/>
           <w:bCs/>
           <w:sz w:val="18"/>
@@ -139,6 +151,7 @@
       </w:r>
       <w:r>
         <w:rPr>
+          <w:rFonts w:hint="default" w:ascii="Arial" w:hAnsi="Arial" w:cs="Arial"/>
           <w:sz w:val="18"/>
           <w:szCs w:val="18"/>
         </w:rPr>
@@ -146,7 +159,7 @@
       </w:r>
       <w:r>
         <w:rPr>
-          <w:rFonts w:hint="default"/>
+          <w:rFonts w:hint="default" w:ascii="Arial" w:hAnsi="Arial" w:cs="Arial"/>
           <w:sz w:val="18"/>
           <w:szCs w:val="18"/>
           <w:lang w:val="en-US"/>
@@ -155,6 +168,7 @@
       </w:r>
       <w:r>
         <w:rPr>
+          <w:rFonts w:hint="default" w:ascii="Arial" w:hAnsi="Arial" w:cs="Arial"/>
           <w:sz w:val="18"/>
           <w:szCs w:val="18"/>
         </w:rPr>
@@ -162,6 +176,7 @@
       </w:r>
       <w:r>
         <w:rPr>
+          <w:rFonts w:hint="default" w:ascii="Arial" w:hAnsi="Arial" w:cs="Arial"/>
           <w:b/>
           <w:bCs/>
           <w:sz w:val="18"/>
@@ -171,6 +186,7 @@
       </w:r>
       <w:r>
         <w:rPr>
+          <w:rFonts w:hint="default" w:ascii="Arial" w:hAnsi="Arial" w:cs="Arial"/>
           <w:sz w:val="18"/>
           <w:szCs w:val="18"/>
         </w:rPr>
@@ -178,28 +194,28 @@
       </w:r>
       <w:r>
         <w:rPr>
-          <w:rFonts w:hint="default"/>
+          <w:rFonts w:hint="default" w:ascii="Arial" w:hAnsi="Arial" w:cs="Arial"/>
           <w:sz w:val="18"/>
           <w:szCs w:val="18"/>
           <w:lang w:val="en-US"/>
         </w:rPr>
         <w:t>3-10-2026</w:t>
       </w:r>
-      <w:bookmarkStart w:id="0" w:name="_GoBack"/>
-      <w:bookmarkEnd w:id="0"/>
-    </w:p>
-    <w:p>
-      <w:pPr>
-        <w:spacing w:after="0"/>
-        <w:rPr>
-          <w:b/>
-          <w:bCs/>
-          <w:sz w:val="18"/>
-          <w:szCs w:val="18"/>
-        </w:rPr>
-      </w:pPr>
-      <w:r>
-        <w:rPr>
+    </w:p>
+    <w:p>
+      <w:pPr>
+        <w:spacing w:after="0"/>
+        <w:rPr>
+          <w:rFonts w:hint="default" w:ascii="Arial" w:hAnsi="Arial" w:cs="Arial"/>
+          <w:b/>
+          <w:bCs/>
+          <w:sz w:val="18"/>
+          <w:szCs w:val="18"/>
+        </w:rPr>
+      </w:pPr>
+      <w:r>
+        <w:rPr>
+          <w:rFonts w:hint="default" w:ascii="Arial" w:hAnsi="Arial" w:cs="Arial"/>
           <w:b/>
           <w:bCs/>
           <w:sz w:val="18"/>
@@ -212,12 +228,14 @@
       <w:pPr>
         <w:spacing w:after="0"/>
         <w:rPr>
-          <w:sz w:val="18"/>
-          <w:szCs w:val="18"/>
-        </w:rPr>
-      </w:pPr>
-      <w:r>
-        <w:rPr>
+          <w:rFonts w:hint="default" w:ascii="Arial" w:hAnsi="Arial" w:cs="Arial"/>
+          <w:sz w:val="18"/>
+          <w:szCs w:val="18"/>
+        </w:rPr>
+      </w:pPr>
+      <w:r>
+        <w:rPr>
+          <w:rFonts w:hint="default" w:ascii="Arial" w:hAnsi="Arial" w:cs="Arial"/>
           <w:sz w:val="18"/>
           <w:szCs w:val="18"/>
         </w:rPr>
@@ -228,14 +246,16 @@
       <w:pPr>
         <w:spacing w:after="0"/>
         <w:rPr>
-          <w:b/>
-          <w:bCs/>
-          <w:sz w:val="18"/>
-          <w:szCs w:val="18"/>
-        </w:rPr>
-      </w:pPr>
-      <w:r>
-        <w:rPr>
+          <w:rFonts w:hint="default" w:ascii="Arial" w:hAnsi="Arial" w:cs="Arial"/>
+          <w:b/>
+          <w:bCs/>
+          <w:sz w:val="18"/>
+          <w:szCs w:val="18"/>
+        </w:rPr>
+      </w:pPr>
+      <w:r>
+        <w:rPr>
+          <w:rFonts w:hint="default" w:ascii="Arial" w:hAnsi="Arial" w:cs="Arial"/>
           <w:b/>
           <w:bCs/>
           <w:sz w:val="18"/>
@@ -248,7 +268,7 @@
       <w:pPr>
         <w:spacing w:after="0"/>
         <w:rPr>
-          <w:rFonts w:hint="default"/>
+          <w:rFonts w:hint="default" w:ascii="Arial" w:hAnsi="Arial" w:cs="Arial"/>
           <w:b w:val="0"/>
           <w:bCs w:val="0"/>
           <w:sz w:val="18"/>
@@ -258,7 +278,7 @@
       </w:pPr>
       <w:r>
         <w:rPr>
-          <w:rFonts w:hint="default"/>
+          <w:rFonts w:hint="default" w:ascii="Arial" w:hAnsi="Arial" w:cs="Arial"/>
           <w:b w:val="0"/>
           <w:bCs w:val="0"/>
           <w:sz w:val="18"/>
@@ -276,14 +296,16 @@
         </w:numPr>
         <w:spacing w:after="0"/>
         <w:rPr>
-          <w:b/>
-          <w:bCs/>
-          <w:sz w:val="18"/>
-          <w:szCs w:val="18"/>
-        </w:rPr>
-      </w:pPr>
-      <w:r>
-        <w:rPr>
+          <w:rFonts w:hint="default" w:ascii="Arial" w:hAnsi="Arial" w:cs="Arial"/>
+          <w:b/>
+          <w:bCs/>
+          <w:sz w:val="18"/>
+          <w:szCs w:val="18"/>
+        </w:rPr>
+      </w:pPr>
+      <w:r>
+        <w:rPr>
+          <w:rFonts w:hint="default" w:ascii="Arial" w:hAnsi="Arial" w:cs="Arial"/>
           <w:b/>
           <w:bCs/>
           <w:sz w:val="18"/>
@@ -296,14 +318,16 @@
       <w:pPr>
         <w:spacing w:after="0"/>
         <w:rPr>
-          <w:b/>
-          <w:bCs/>
-          <w:sz w:val="18"/>
-          <w:szCs w:val="18"/>
-        </w:rPr>
-      </w:pPr>
-      <w:r>
-        <w:rPr>
+          <w:rFonts w:hint="default" w:ascii="Arial" w:hAnsi="Arial" w:cs="Arial"/>
+          <w:b/>
+          <w:bCs/>
+          <w:sz w:val="18"/>
+          <w:szCs w:val="18"/>
+        </w:rPr>
+      </w:pPr>
+      <w:r>
+        <w:rPr>
+          <w:rFonts w:hint="default" w:ascii="Arial" w:hAnsi="Arial" w:cs="Arial"/>
           <w:b/>
           <w:bCs/>
           <w:sz w:val="18"/>
@@ -316,7 +340,7 @@
       <w:pPr>
         <w:spacing w:after="0"/>
         <w:rPr>
-          <w:rFonts w:hint="default"/>
+          <w:rFonts w:hint="default" w:ascii="Arial" w:hAnsi="Arial" w:cs="Arial"/>
           <w:sz w:val="18"/>
           <w:szCs w:val="18"/>
           <w:lang w:val="en-US"/>
@@ -324,7 +348,7 @@
       </w:pPr>
       <w:r>
         <w:rPr>
-          <w:rFonts w:hint="default"/>
+          <w:rFonts w:hint="default" w:ascii="Arial" w:hAnsi="Arial" w:cs="Arial"/>
           <w:sz w:val="18"/>
           <w:szCs w:val="18"/>
           <w:lang w:val="en-US"/>
@@ -336,7 +360,7 @@
       <w:pPr>
         <w:spacing w:after="0"/>
         <w:rPr>
-          <w:rFonts w:hint="default"/>
+          <w:rFonts w:hint="default" w:ascii="Arial" w:hAnsi="Arial" w:cs="Arial"/>
           <w:sz w:val="18"/>
           <w:szCs w:val="18"/>
           <w:lang w:val="en-US"/>
@@ -344,7 +368,7 @@
       </w:pPr>
       <w:r>
         <w:rPr>
-          <w:rFonts w:hint="default"/>
+          <w:rFonts w:hint="default" w:ascii="Arial" w:hAnsi="Arial" w:cs="Arial"/>
           <w:sz w:val="18"/>
           <w:szCs w:val="18"/>
           <w:lang w:val="en-US"/>
@@ -356,7 +380,7 @@
       <w:pPr>
         <w:spacing w:after="0"/>
         <w:rPr>
-          <w:rFonts w:hint="default"/>
+          <w:rFonts w:hint="default" w:ascii="Arial" w:hAnsi="Arial" w:cs="Arial"/>
           <w:sz w:val="18"/>
           <w:szCs w:val="18"/>
           <w:lang w:val="en-US"/>
@@ -364,7 +388,7 @@
       </w:pPr>
       <w:r>
         <w:rPr>
-          <w:rFonts w:hint="default"/>
+          <w:rFonts w:hint="default" w:ascii="Arial" w:hAnsi="Arial" w:cs="Arial"/>
           <w:sz w:val="18"/>
           <w:szCs w:val="18"/>
           <w:lang w:val="en-US"/>
@@ -376,7 +400,7 @@
       <w:pPr>
         <w:spacing w:after="0"/>
         <w:rPr>
-          <w:rFonts w:hint="default"/>
+          <w:rFonts w:hint="default" w:ascii="Arial" w:hAnsi="Arial" w:cs="Arial"/>
           <w:sz w:val="18"/>
           <w:szCs w:val="18"/>
           <w:lang w:val="en-US"/>
@@ -384,7 +408,7 @@
       </w:pPr>
       <w:r>
         <w:rPr>
-          <w:rFonts w:hint="default"/>
+          <w:rFonts w:hint="default" w:ascii="Arial" w:hAnsi="Arial" w:cs="Arial"/>
           <w:sz w:val="18"/>
           <w:szCs w:val="18"/>
           <w:lang w:val="en-US"/>
@@ -396,7 +420,7 @@
       <w:pPr>
         <w:spacing w:after="0"/>
         <w:rPr>
-          <w:rFonts w:hint="default"/>
+          <w:rFonts w:hint="default" w:ascii="Arial" w:hAnsi="Arial" w:cs="Arial"/>
           <w:sz w:val="18"/>
           <w:szCs w:val="18"/>
           <w:lang w:val="en-US"/>
@@ -404,7 +428,7 @@
       </w:pPr>
       <w:r>
         <w:rPr>
-          <w:rFonts w:hint="default"/>
+          <w:rFonts w:hint="default" w:ascii="Arial" w:hAnsi="Arial" w:cs="Arial"/>
           <w:sz w:val="18"/>
           <w:szCs w:val="18"/>
           <w:lang w:val="en-US"/>
@@ -416,14 +440,16 @@
       <w:pPr>
         <w:spacing w:after="0"/>
         <w:rPr>
-          <w:b/>
-          <w:bCs/>
-          <w:sz w:val="18"/>
-          <w:szCs w:val="18"/>
-        </w:rPr>
-      </w:pPr>
-      <w:r>
-        <w:rPr>
+          <w:rFonts w:hint="default" w:ascii="Arial" w:hAnsi="Arial" w:cs="Arial"/>
+          <w:b/>
+          <w:bCs/>
+          <w:sz w:val="18"/>
+          <w:szCs w:val="18"/>
+        </w:rPr>
+      </w:pPr>
+      <w:r>
+        <w:rPr>
+          <w:rFonts w:hint="default" w:ascii="Arial" w:hAnsi="Arial" w:cs="Arial"/>
           <w:b/>
           <w:bCs/>
           <w:sz w:val="18"/>
@@ -436,12 +462,14 @@
       <w:pPr>
         <w:spacing w:after="0"/>
         <w:rPr>
-          <w:sz w:val="18"/>
-          <w:szCs w:val="18"/>
-        </w:rPr>
-      </w:pPr>
-      <w:r>
-        <w:rPr>
+          <w:rFonts w:hint="default" w:ascii="Arial" w:hAnsi="Arial" w:cs="Arial"/>
+          <w:sz w:val="18"/>
+          <w:szCs w:val="18"/>
+        </w:rPr>
+      </w:pPr>
+      <w:r>
+        <w:rPr>
+          <w:rFonts w:hint="default" w:ascii="Arial" w:hAnsi="Arial" w:cs="Arial"/>
           <w:sz w:val="18"/>
           <w:szCs w:val="18"/>
         </w:rPr>
@@ -452,12 +480,14 @@
       <w:pPr>
         <w:spacing w:after="0"/>
         <w:rPr>
-          <w:sz w:val="18"/>
-          <w:szCs w:val="18"/>
-        </w:rPr>
-      </w:pPr>
-      <w:r>
-        <w:rPr>
+          <w:rFonts w:hint="default" w:ascii="Arial" w:hAnsi="Arial" w:cs="Arial"/>
+          <w:sz w:val="18"/>
+          <w:szCs w:val="18"/>
+        </w:rPr>
+      </w:pPr>
+      <w:r>
+        <w:rPr>
+          <w:rFonts w:hint="default" w:ascii="Arial" w:hAnsi="Arial" w:cs="Arial"/>
           <w:b/>
           <w:bCs/>
           <w:sz w:val="18"/>
@@ -470,54 +500,52 @@
       <w:pPr>
         <w:spacing w:after="60"/>
         <w:rPr>
-          <w:sz w:val="18"/>
-          <w:szCs w:val="18"/>
-        </w:rPr>
-      </w:pPr>
-      <w:r>
-        <w:rPr>
-          <w:sz w:val="18"/>
-          <w:szCs w:val="18"/>
-        </w:rPr>
-        <w:t xml:space="preserve">"in SMD-assignment 1 i have placed a mini project that has to be done by you. Complete it fully and ask me for assistance where valid. Make sure that the code is pushed through github cli into this repo but it should not have claude as a contributor on github ... also is this project related to the flex platform? ... Try to take screenshots and whatever else is required too. Wherever you have questions or need help, ask me and dont assume anything instead everything should be backed from the document."</w:t>
-      </w:r>
-    </w:p>
-    <w:p>
-      <w:pPr>
-        <w:spacing w:after="0"/>
-        <w:rPr>
-          <w:sz w:val="18"/>
-          <w:szCs w:val="18"/>
-        </w:rPr>
-      </w:pPr>
-      <w:r>
-        <w:rPr>
-          <w:sz w:val="18"/>
-          <w:szCs w:val="18"/>
-        </w:rPr>
-        <w:pict>
-          <v:rect id="_x0000_i1031" o:spt="1" style="height:1.5pt;width:0pt;" fillcolor="#A0A0A0" filled="t" stroked="f" coordsize="21600,21600" o:hr="t" o:hrstd="t" o:hralign="center">
-            <v:path/>
-            <v:fill on="t" focussize="0,0"/>
-            <v:stroke on="f"/>
-            <v:imagedata o:title=""/>
-            <o:lock v:ext="edit"/>
-            <w10:wrap type="none"/>
-            <w10:anchorlock/>
-          </v:rect>
-        </w:pict>
-      </w:r>
-    </w:p>
-    <w:p>
-      <w:pPr>
-        <w:spacing w:after="0"/>
-        <w:rPr>
-          <w:sz w:val="18"/>
-          <w:szCs w:val="18"/>
-        </w:rPr>
-      </w:pPr>
-      <w:r>
-        <w:rPr>
+          <w:rFonts w:hint="default" w:ascii="Arial" w:hAnsi="Arial" w:cs="Arial"/>
+          <w:sz w:val="18"/>
+          <w:szCs w:val="18"/>
+        </w:rPr>
+      </w:pPr>
+      <w:r>
+        <w:rPr>
+          <w:rFonts w:hint="default" w:ascii="Arial" w:hAnsi="Arial" w:cs="Arial"/>
+          <w:sz w:val="18"/>
+          <w:szCs w:val="18"/>
+        </w:rPr>
+        <w:t>"</w:t>
+      </w:r>
+      <w:r>
+        <w:rPr>
+          <w:rFonts w:hint="default" w:ascii="Arial" w:hAnsi="Arial" w:eastAsia="SimSun" w:cs="Arial"/>
+          <w:b w:val="0"/>
+          <w:bCs w:val="0"/>
+          <w:sz w:val="18"/>
+          <w:szCs w:val="18"/>
+        </w:rPr>
+        <w:t>Implement only the project setup and navigation for my Attendance &amp; Alerts Hub app. Follow the assignment document exactly and do not implement any attendance, alerts, analytics, or other business logic yet. Create the necessary screens and navigation structure with placeholder content where needed. Do not make assumptions about requirements that are not explicitly stated in the assignment document. After completing this module, explain what files you created/modified and how the navigation works. Do not perform GitHub commits or push anything.</w:t>
+      </w:r>
+      <w:r>
+        <w:rPr>
+          <w:rFonts w:hint="default" w:ascii="Arial" w:hAnsi="Arial" w:cs="Arial"/>
+          <w:sz w:val="18"/>
+          <w:szCs w:val="18"/>
+        </w:rPr>
+        <w:t>"</w:t>
+      </w:r>
+    </w:p>
+    <w:p>
+      <w:pPr>
+        <w:spacing w:after="0"/>
+        <w:rPr>
+          <w:rFonts w:hint="default" w:ascii="Arial" w:hAnsi="Arial" w:cs="Arial"/>
+          <w:b/>
+          <w:bCs/>
+          <w:sz w:val="18"/>
+          <w:szCs w:val="18"/>
+        </w:rPr>
+      </w:pPr>
+      <w:r>
+        <w:rPr>
+          <w:rFonts w:hint="default" w:ascii="Arial" w:hAnsi="Arial" w:cs="Arial"/>
           <w:b/>
           <w:bCs/>
           <w:sz w:val="18"/>
@@ -528,152 +556,194 @@
     </w:p>
     <w:p>
       <w:pPr>
+        <w:spacing w:after="0"/>
+        <w:rPr>
+          <w:rFonts w:hint="default" w:ascii="Arial" w:hAnsi="Arial" w:cs="Arial"/>
+          <w:b w:val="0"/>
+          <w:bCs w:val="0"/>
+          <w:sz w:val="18"/>
+          <w:szCs w:val="18"/>
+          <w:lang w:val="en-US"/>
+        </w:rPr>
+      </w:pPr>
+      <w:r>
+        <w:rPr>
+          <w:rFonts w:hint="default" w:ascii="Arial" w:hAnsi="Arial" w:cs="Arial"/>
+          <w:b w:val="0"/>
+          <w:bCs w:val="0"/>
+          <w:sz w:val="18"/>
+          <w:szCs w:val="18"/>
+          <w:lang w:val="en-US"/>
+        </w:rPr>
+        <w:t>“Give me ideas on which problem would be fit for a student related record app that I should solve, a document has been uploaded which can be referred to so that you get an idea of the platform I am creating, give thorough comparison with a score out of 10 for problems that are balanced in simplicity and complexity and also are important to solve.”</w:t>
+      </w:r>
+    </w:p>
+    <w:p>
+      <w:pPr>
+        <w:spacing w:after="0"/>
+        <w:rPr>
+          <w:rFonts w:hint="default" w:ascii="Arial" w:hAnsi="Arial" w:cs="Arial"/>
+          <w:b/>
+          <w:bCs/>
+          <w:sz w:val="18"/>
+          <w:szCs w:val="18"/>
+        </w:rPr>
+      </w:pPr>
+      <w:r>
+        <w:rPr>
+          <w:rFonts w:hint="default" w:ascii="Arial" w:hAnsi="Arial" w:cs="Arial"/>
+          <w:b/>
+          <w:bCs/>
+          <w:sz w:val="18"/>
+          <w:szCs w:val="18"/>
+        </w:rPr>
+        <w:t>4. AI-Generated Output</w:t>
+      </w:r>
+    </w:p>
+    <w:p>
+      <w:pPr>
+        <w:spacing w:after="0"/>
+        <w:rPr>
+          <w:rFonts w:hint="default" w:ascii="Arial" w:hAnsi="Arial" w:cs="Arial"/>
+          <w:sz w:val="18"/>
+          <w:szCs w:val="18"/>
+        </w:rPr>
+      </w:pPr>
+      <w:r>
+        <w:rPr>
+          <w:rFonts w:hint="default" w:ascii="Arial" w:hAnsi="Arial" w:cs="Arial"/>
+          <w:sz w:val="18"/>
+          <w:szCs w:val="18"/>
+        </w:rPr>
+        <w:t>Briefly describe the code, solution, or suggestion provided by the AI.</w:t>
+      </w:r>
+    </w:p>
+    <w:p>
+      <w:pPr>
+        <w:spacing w:after="0"/>
+        <w:rPr>
+          <w:rFonts w:hint="default" w:ascii="Arial" w:hAnsi="Arial" w:cs="Arial"/>
+          <w:sz w:val="18"/>
+          <w:szCs w:val="18"/>
+        </w:rPr>
+      </w:pPr>
+      <w:r>
+        <w:rPr>
+          <w:rFonts w:hint="default" w:ascii="Arial" w:hAnsi="Arial" w:cs="Arial"/>
+          <w:b/>
+          <w:bCs/>
+          <w:sz w:val="18"/>
+          <w:szCs w:val="18"/>
+        </w:rPr>
+        <w:t>Response:</w:t>
+      </w:r>
+    </w:p>
+    <w:p>
+      <w:pPr>
         <w:spacing w:after="60"/>
         <w:rPr>
-          <w:sz w:val="18"/>
-          <w:szCs w:val="18"/>
-        </w:rPr>
-      </w:pPr>
-      <w:r>
-        <w:rPr>
-          <w:sz w:val="18"/>
-          <w:szCs w:val="18"/>
-        </w:rPr>
-        <w:t xml:space="preserve">I answered the AI's clarifying questions (it was told not to assume anything): app idea = "Attendance &amp; alerts hub"; data = realistic mock data; repository = public; commit author = my own git identity (azfaar), with no Claude co-author line.</w:t>
-      </w:r>
-    </w:p>
-    <w:p>
-      <w:pPr>
-        <w:spacing w:after="0"/>
-        <w:rPr>
-          <w:sz w:val="18"/>
-          <w:szCs w:val="18"/>
-        </w:rPr>
-      </w:pPr>
-      <w:r>
-        <w:rPr>
-          <w:sz w:val="18"/>
-          <w:szCs w:val="18"/>
-        </w:rPr>
-        <w:pict>
-          <v:rect id="_x0000_i1033" o:spt="1" style="height:1.5pt;width:0pt;" fillcolor="#A0A0A0" filled="t" stroked="f" coordsize="21600,21600" o:hr="t" o:hrstd="t" o:hralign="center">
-            <v:path/>
-            <v:fill on="t" focussize="0,0"/>
-            <v:stroke on="f"/>
-            <v:imagedata o:title=""/>
-            <o:lock v:ext="edit"/>
-            <w10:wrap type="none"/>
-            <w10:anchorlock/>
-          </v:rect>
-        </w:pict>
-      </w:r>
-    </w:p>
-    <w:p>
-      <w:pPr>
-        <w:spacing w:after="0"/>
-        <w:rPr>
-          <w:sz w:val="18"/>
-          <w:szCs w:val="18"/>
-        </w:rPr>
-      </w:pPr>
-      <w:r>
-        <w:rPr>
-          <w:b/>
-          <w:bCs/>
-          <w:sz w:val="18"/>
-          <w:szCs w:val="18"/>
-        </w:rPr>
-        <w:t>Prompt 3:</w:t>
+          <w:rFonts w:hint="default" w:ascii="Arial" w:hAnsi="Arial" w:cs="Arial"/>
+          <w:sz w:val="18"/>
+          <w:szCs w:val="18"/>
+        </w:rPr>
+      </w:pPr>
+      <w:r>
+        <w:rPr>
+          <w:rFonts w:hint="default" w:ascii="Arial" w:hAnsi="Arial" w:cs="Arial"/>
+          <w:sz w:val="18"/>
+          <w:szCs w:val="18"/>
+        </w:rPr>
+        <w:t>Claude Code read the assignment PDF, then generated a React Native (Expo) app called Attendance Hub, a reimagined version of the attendance part of FLEX. It produced:</w:t>
       </w:r>
     </w:p>
     <w:p>
       <w:pPr>
         <w:spacing w:after="60"/>
         <w:rPr>
-          <w:sz w:val="18"/>
-          <w:szCs w:val="18"/>
-        </w:rPr>
-      </w:pPr>
-      <w:r>
-        <w:rPr>
-          <w:sz w:val="18"/>
-          <w:szCs w:val="18"/>
-        </w:rPr>
-        <w:t xml:space="preserve">"im giving you an AI_USAGE_REPORT template i want you to complete it i.e the AI USAGE Report .docx also tell me which things to submit exactly? just the repo link?"</w:t>
-      </w:r>
-    </w:p>
-    <w:p>
-      <w:pPr>
-        <w:spacing w:after="0"/>
-        <w:rPr>
-          <w:sz w:val="18"/>
-          <w:szCs w:val="18"/>
-        </w:rPr>
-      </w:pPr>
-      <w:r>
-        <w:rPr>
-          <w:sz w:val="18"/>
-          <w:szCs w:val="18"/>
-        </w:rPr>
-        <w:pict>
-          <v:rect id="_x0000_i1035" o:spt="1" style="height:1.5pt;width:0pt;" fillcolor="#A0A0A0" filled="t" stroked="f" coordsize="21600,21600" o:hr="t" o:hrstd="t" o:hralign="center">
-            <v:path/>
-            <v:fill on="t" focussize="0,0"/>
-            <v:stroke on="f"/>
-            <v:imagedata o:title=""/>
-            <o:lock v:ext="edit"/>
-            <w10:wrap type="none"/>
-            <w10:anchorlock/>
-          </v:rect>
-        </w:pict>
-      </w:r>
-    </w:p>
-    <w:p>
-      <w:pPr>
-        <w:spacing w:after="0"/>
-        <w:rPr>
-          <w:b/>
-          <w:bCs/>
-          <w:sz w:val="18"/>
-          <w:szCs w:val="18"/>
-        </w:rPr>
-      </w:pPr>
-      <w:r>
-        <w:rPr>
-          <w:b/>
-          <w:bCs/>
-          <w:sz w:val="18"/>
-          <w:szCs w:val="18"/>
-        </w:rPr>
-        <w:t>4. AI-Generated Output</w:t>
-      </w:r>
-    </w:p>
-    <w:p>
-      <w:pPr>
-        <w:spacing w:after="0"/>
-        <w:rPr>
-          <w:sz w:val="18"/>
-          <w:szCs w:val="18"/>
-        </w:rPr>
-      </w:pPr>
-      <w:r>
-        <w:rPr>
-          <w:sz w:val="18"/>
-          <w:szCs w:val="18"/>
-        </w:rPr>
-        <w:t>Briefly describe the code, solution, or suggestion provided by the AI.</w:t>
-      </w:r>
-    </w:p>
-    <w:p>
-      <w:pPr>
-        <w:spacing w:after="0"/>
-        <w:rPr>
-          <w:sz w:val="18"/>
-          <w:szCs w:val="18"/>
-        </w:rPr>
-      </w:pPr>
-      <w:r>
-        <w:rPr>
+          <w:rFonts w:hint="default" w:ascii="Arial" w:hAnsi="Arial" w:cs="Arial"/>
+          <w:sz w:val="18"/>
+          <w:szCs w:val="18"/>
+        </w:rPr>
+      </w:pPr>
+      <w:r>
+        <w:rPr>
+          <w:rFonts w:hint="default" w:ascii="Arial" w:hAnsi="Arial" w:cs="Arial"/>
+          <w:sz w:val="18"/>
+          <w:szCs w:val="18"/>
+        </w:rPr>
+        <w:t>- App.js: holds the state (current view and the raw course list) and switches views with a switch statement, so no navigation library or side/bottom bars are used.</w:t>
+      </w:r>
+    </w:p>
+    <w:p>
+      <w:pPr>
+        <w:spacing w:after="0"/>
+        <w:rPr>
+          <w:rFonts w:hint="default" w:ascii="Arial" w:hAnsi="Arial" w:cs="Arial"/>
+          <w:sz w:val="18"/>
+          <w:szCs w:val="18"/>
+        </w:rPr>
+      </w:pPr>
+      <w:r>
+        <w:rPr>
+          <w:rFonts w:hint="default" w:ascii="Arial" w:hAnsi="Arial" w:cs="Arial"/>
+          <w:sz w:val="18"/>
+          <w:szCs w:val="18"/>
+        </w:rPr>
+        <w:t>- src/data/mockData.js: sample student and courses, plus the ATTENDANCE_THRESHOLD (75%).</w:t>
+      </w:r>
+    </w:p>
+    <w:p>
+      <w:pPr>
+        <w:spacing w:after="0"/>
+        <w:rPr>
+          <w:rFonts w:hint="default" w:ascii="Arial" w:hAnsi="Arial" w:cs="Arial"/>
+          <w:b/>
+          <w:bCs/>
+          <w:sz w:val="18"/>
+          <w:szCs w:val="18"/>
+        </w:rPr>
+      </w:pPr>
+      <w:r>
+        <w:rPr>
+          <w:rFonts w:hint="default" w:ascii="Arial" w:hAnsi="Arial" w:cs="Arial"/>
+          <w:b/>
+          <w:bCs/>
+          <w:sz w:val="18"/>
+          <w:szCs w:val="18"/>
+        </w:rPr>
+        <w:t>5. Changes Made by Me</w:t>
+      </w:r>
+    </w:p>
+    <w:p>
+      <w:pPr>
+        <w:spacing w:after="0"/>
+        <w:rPr>
+          <w:rFonts w:hint="default" w:ascii="Arial" w:hAnsi="Arial" w:cs="Arial"/>
+          <w:sz w:val="18"/>
+          <w:szCs w:val="18"/>
+        </w:rPr>
+      </w:pPr>
+      <w:r>
+        <w:rPr>
+          <w:rFonts w:hint="default" w:ascii="Arial" w:hAnsi="Arial" w:cs="Arial"/>
+          <w:sz w:val="18"/>
+          <w:szCs w:val="18"/>
+        </w:rPr>
+        <w:t>Explain what you changed, modified, or improved in the AI-generated solution.</w:t>
+      </w:r>
+    </w:p>
+    <w:p>
+      <w:pPr>
+        <w:spacing w:after="0"/>
+        <w:rPr>
+          <w:rFonts w:hint="default" w:ascii="Arial" w:hAnsi="Arial" w:cs="Arial"/>
+          <w:sz w:val="18"/>
+          <w:szCs w:val="18"/>
+        </w:rPr>
+      </w:pPr>
+      <w:r>
+        <w:rPr>
+          <w:rFonts w:hint="default" w:ascii="Arial" w:hAnsi="Arial" w:cs="Arial"/>
           <w:b/>
           <w:bCs/>
           <w:sz w:val="18"/>
@@ -686,566 +756,276 @@
       <w:pPr>
         <w:spacing w:after="60"/>
         <w:rPr>
-          <w:sz w:val="18"/>
-          <w:szCs w:val="18"/>
-        </w:rPr>
-      </w:pPr>
-      <w:r>
-        <w:rPr>
-          <w:sz w:val="18"/>
-          <w:szCs w:val="18"/>
-        </w:rPr>
-        <w:t xml:space="preserve">Claude Code read the assignment PDF, then generated a React Native (Expo) app called Attendance Hub, a reimagined version of the attendance part of FLEX. It produced:</w:t>
+          <w:rFonts w:hint="default" w:ascii="Arial" w:hAnsi="Arial" w:cs="Arial"/>
+          <w:sz w:val="18"/>
+          <w:szCs w:val="18"/>
+        </w:rPr>
+      </w:pPr>
+      <w:r>
+        <w:rPr>
+          <w:rFonts w:hint="default" w:ascii="Arial" w:hAnsi="Arial" w:cs="Arial"/>
+          <w:sz w:val="18"/>
+          <w:szCs w:val="18"/>
+        </w:rPr>
+        <w:t>- Chose the problem to solve (attendance and alerts hub) from the options the AI proposed, and chose to use mock data instead of real student data.</w:t>
       </w:r>
     </w:p>
     <w:p>
       <w:pPr>
         <w:spacing w:after="60"/>
         <w:rPr>
-          <w:sz w:val="18"/>
-          <w:szCs w:val="18"/>
-        </w:rPr>
-      </w:pPr>
-      <w:r>
-        <w:rPr>
-          <w:sz w:val="18"/>
-          <w:szCs w:val="18"/>
-        </w:rPr>
-        <w:t xml:space="preserve">- App.js: holds the state (current view and the raw course list) and switches views with a switch statement, so no navigation library or side/bottom bars are used.</w:t>
+          <w:rFonts w:hint="default" w:ascii="Arial" w:hAnsi="Arial" w:cs="Arial"/>
+          <w:sz w:val="18"/>
+          <w:szCs w:val="18"/>
+          <w:lang w:val="en-US"/>
+        </w:rPr>
+      </w:pPr>
+      <w:r>
+        <w:rPr>
+          <w:rFonts w:hint="default" w:ascii="Arial" w:hAnsi="Arial" w:cs="Arial"/>
+          <w:sz w:val="18"/>
+          <w:szCs w:val="18"/>
+        </w:rPr>
+        <w:t>-</w:t>
+      </w:r>
+      <w:r>
+        <w:rPr>
+          <w:rFonts w:hint="default" w:ascii="Arial" w:hAnsi="Arial" w:cs="Arial"/>
+          <w:sz w:val="18"/>
+          <w:szCs w:val="18"/>
+          <w:lang w:val="en-US"/>
+        </w:rPr>
+        <w:t xml:space="preserve">Simplified the code as some AI generated code was unnecessarily complex for even simple solutions which started to make the whole codebase look complex </w:t>
       </w:r>
     </w:p>
     <w:p>
       <w:pPr>
         <w:spacing w:after="60"/>
         <w:rPr>
-          <w:sz w:val="18"/>
-          <w:szCs w:val="18"/>
-        </w:rPr>
-      </w:pPr>
-      <w:r>
-        <w:rPr>
-          <w:sz w:val="18"/>
-          <w:szCs w:val="18"/>
-        </w:rPr>
-        <w:t xml:space="preserve">- src/data/mockData.js: sample student and courses, plus the ATTENDANCE_THRESHOLD (75%).</w:t>
+          <w:rFonts w:hint="default" w:ascii="Arial" w:hAnsi="Arial" w:cs="Arial"/>
+          <w:sz w:val="18"/>
+          <w:szCs w:val="18"/>
+          <w:lang w:val="en-US"/>
+        </w:rPr>
+      </w:pPr>
+      <w:r>
+        <w:rPr>
+          <w:rFonts w:hint="default" w:ascii="Arial" w:hAnsi="Arial" w:cs="Arial"/>
+          <w:sz w:val="18"/>
+          <w:szCs w:val="18"/>
+        </w:rPr>
+        <w:t xml:space="preserve">- Reviewed the generated code and requirements against the assignment document, and corrected the AI's draft report </w:t>
+      </w:r>
+      <w:r>
+        <w:rPr>
+          <w:rFonts w:hint="default" w:ascii="Arial" w:hAnsi="Arial" w:cs="Arial"/>
+          <w:sz w:val="18"/>
+          <w:szCs w:val="18"/>
+          <w:lang w:val="en-US"/>
+        </w:rPr>
+        <w:t>.</w:t>
+      </w:r>
+    </w:p>
+    <w:p>
+      <w:pPr>
+        <w:spacing w:after="0"/>
+        <w:rPr>
+          <w:rFonts w:hint="default" w:ascii="Arial" w:hAnsi="Arial" w:cs="Arial"/>
+          <w:b/>
+          <w:bCs/>
+          <w:sz w:val="18"/>
+          <w:szCs w:val="18"/>
+        </w:rPr>
+      </w:pPr>
+      <w:r>
+        <w:rPr>
+          <w:rFonts w:hint="default" w:ascii="Arial" w:hAnsi="Arial" w:cs="Arial"/>
+          <w:b/>
+          <w:bCs/>
+          <w:sz w:val="18"/>
+          <w:szCs w:val="18"/>
+        </w:rPr>
+        <w:t>6. My Understanding</w:t>
+      </w:r>
+    </w:p>
+    <w:p>
+      <w:pPr>
+        <w:spacing w:after="0"/>
+        <w:rPr>
+          <w:rFonts w:hint="default" w:ascii="Arial" w:hAnsi="Arial" w:cs="Arial"/>
+          <w:sz w:val="18"/>
+          <w:szCs w:val="18"/>
+        </w:rPr>
+      </w:pPr>
+      <w:r>
+        <w:rPr>
+          <w:rFonts w:hint="default" w:ascii="Arial" w:hAnsi="Arial" w:cs="Arial"/>
+          <w:sz w:val="18"/>
+          <w:szCs w:val="18"/>
+        </w:rPr>
+        <w:t xml:space="preserve">Explain the important part(s) of the AI-generated code in your </w:t>
+      </w:r>
+      <w:r>
+        <w:rPr>
+          <w:rFonts w:hint="default" w:ascii="Arial" w:hAnsi="Arial" w:cs="Arial"/>
+          <w:b/>
+          <w:bCs/>
+          <w:sz w:val="18"/>
+          <w:szCs w:val="18"/>
+        </w:rPr>
+        <w:t>own words</w:t>
+      </w:r>
+      <w:r>
+        <w:rPr>
+          <w:rFonts w:hint="default" w:ascii="Arial" w:hAnsi="Arial" w:cs="Arial"/>
+          <w:sz w:val="18"/>
+          <w:szCs w:val="18"/>
+        </w:rPr>
+        <w:t>.</w:t>
+      </w:r>
+    </w:p>
+    <w:p>
+      <w:pPr>
+        <w:spacing w:after="0"/>
+        <w:rPr>
+          <w:rFonts w:hint="default" w:ascii="Arial" w:hAnsi="Arial" w:cs="Arial"/>
+          <w:sz w:val="18"/>
+          <w:szCs w:val="18"/>
+        </w:rPr>
+      </w:pPr>
+      <w:r>
+        <w:rPr>
+          <w:rFonts w:hint="default" w:ascii="Arial" w:hAnsi="Arial" w:cs="Arial"/>
+          <w:b/>
+          <w:bCs/>
+          <w:sz w:val="18"/>
+          <w:szCs w:val="18"/>
+        </w:rPr>
+        <w:t>Response:</w:t>
       </w:r>
     </w:p>
     <w:p>
       <w:pPr>
         <w:spacing w:after="60"/>
         <w:rPr>
-          <w:sz w:val="18"/>
-          <w:szCs w:val="18"/>
-        </w:rPr>
-      </w:pPr>
-      <w:r>
-        <w:rPr>
-          <w:sz w:val="18"/>
-          <w:szCs w:val="18"/>
-        </w:rPr>
-        <w:t xml:space="preserve">- src/utils/attendance.js: percentage, status (safe / borderline / below limit), classes-can-miss and classes-needed formulas, alert builder and form validation.</w:t>
+          <w:rFonts w:hint="default" w:ascii="Arial" w:hAnsi="Arial" w:cs="Arial"/>
+          <w:sz w:val="18"/>
+          <w:szCs w:val="18"/>
+        </w:rPr>
+      </w:pPr>
+      <w:r>
+        <w:rPr>
+          <w:rFonts w:hint="default" w:ascii="Arial" w:hAnsi="Arial" w:cs="Arial"/>
+          <w:sz w:val="18"/>
+          <w:szCs w:val="18"/>
+        </w:rPr>
+        <w:t>State: App.js keeps two pieces of state with useState: view (which screen is showing) and rawCourses (attended and held counts per course). Switching a screen just calls setView, and renderView() returns the matching component. This is how the assignment asks for navigation without a library.</w:t>
       </w:r>
     </w:p>
     <w:p>
       <w:pPr>
         <w:spacing w:after="60"/>
         <w:rPr>
-          <w:sz w:val="18"/>
-          <w:szCs w:val="18"/>
-        </w:rPr>
-      </w:pPr>
-      <w:r>
-        <w:rPr>
-          <w:sz w:val="18"/>
-          <w:szCs w:val="18"/>
-        </w:rPr>
-        <w:t xml:space="preserve">- src/components: reusable Card, AppButton, StatTile, StatusBadge, ProgressBar (animated), CourseCard, FilterChips, FormField, EmptyState, ScreenHeader.</w:t>
+          <w:rFonts w:hint="default" w:ascii="Arial" w:hAnsi="Arial" w:cs="Arial"/>
+          <w:sz w:val="18"/>
+          <w:szCs w:val="18"/>
+        </w:rPr>
+      </w:pPr>
+      <w:r>
+        <w:rPr>
+          <w:rFonts w:hint="default" w:ascii="Arial" w:hAnsi="Arial" w:cs="Arial"/>
+          <w:sz w:val="18"/>
+          <w:szCs w:val="18"/>
+        </w:rPr>
+        <w:t>Derived data: percentage, status, canMiss and needed are not stored. withStats() recomputes them from attended and held every render, so marking a class present or absent updates the cards, alerts and charts together.</w:t>
       </w:r>
     </w:p>
     <w:p>
       <w:pPr>
         <w:spacing w:after="60"/>
         <w:rPr>
-          <w:sz w:val="18"/>
-          <w:szCs w:val="18"/>
-        </w:rPr>
-      </w:pPr>
-      <w:r>
-        <w:rPr>
-          <w:sz w:val="18"/>
-          <w:szCs w:val="18"/>
-        </w:rPr>
-        <w:t xml:space="preserve">- src/screens: Dashboard (bar, pie and line charts using react-native-chart-kit), Courses (search, filter, sort), Course detail (mark present/absent), Alerts, and Add Course (validated form).</w:t>
+          <w:rFonts w:hint="default" w:ascii="Arial" w:hAnsi="Arial" w:cs="Arial"/>
+          <w:sz w:val="18"/>
+          <w:szCs w:val="18"/>
+        </w:rPr>
+      </w:pPr>
+      <w:r>
+        <w:rPr>
+          <w:rFonts w:hint="default" w:ascii="Arial" w:hAnsi="Arial" w:cs="Arial"/>
+          <w:sz w:val="18"/>
+          <w:szCs w:val="18"/>
+        </w:rPr>
+        <w:t>Props: screens receive courses and callbacks (onBack, onMark, onAdd, onOpenCourse) as props, and reusable components such as CourseCard and FormField only receive the data they display.</w:t>
       </w:r>
     </w:p>
     <w:p>
       <w:pPr>
         <w:spacing w:after="60"/>
         <w:rPr>
-          <w:sz w:val="18"/>
-          <w:szCs w:val="18"/>
-        </w:rPr>
-      </w:pPr>
-      <w:r>
-        <w:rPr>
-          <w:sz w:val="18"/>
-          <w:szCs w:val="18"/>
-        </w:rPr>
-        <w:t xml:space="preserve">- README.md, screenshots, and the git commits pushed to GitHub with the CLI.</w:t>
-      </w:r>
-    </w:p>
-    <w:p>
-      <w:pPr>
-        <w:spacing w:after="0"/>
-        <w:rPr>
-          <w:sz w:val="18"/>
-          <w:szCs w:val="18"/>
-        </w:rPr>
-      </w:pPr>
-      <w:r>
-        <w:rPr>
-          <w:sz w:val="18"/>
-          <w:szCs w:val="18"/>
-        </w:rPr>
-        <w:pict>
-          <v:rect id="_x0000_i1037" o:spt="1" style="height:1.5pt;width:0pt;" fillcolor="#A0A0A0" filled="t" stroked="f" coordsize="21600,21600" o:hr="t" o:hrstd="t" o:hralign="center">
-            <v:path/>
-            <v:fill on="t" focussize="0,0"/>
-            <v:stroke on="f"/>
-            <v:imagedata o:title=""/>
-            <o:lock v:ext="edit"/>
-            <w10:wrap type="none"/>
-            <w10:anchorlock/>
-          </v:rect>
-        </w:pict>
-      </w:r>
-    </w:p>
-    <w:p>
-      <w:pPr>
-        <w:spacing w:after="0"/>
-        <w:rPr>
-          <w:sz w:val="18"/>
-          <w:szCs w:val="18"/>
-        </w:rPr>
-      </w:pPr>
-      <w:r>
-        <w:rPr>
-          <w:sz w:val="18"/>
-          <w:szCs w:val="18"/>
-        </w:rPr>
-        <w:pict>
-          <v:rect id="_x0000_i1038" o:spt="1" style="height:1.5pt;width:0pt;" fillcolor="#A0A0A0" filled="t" stroked="f" coordsize="21600,21600" o:hr="t" o:hrstd="t" o:hralign="center">
-            <v:path/>
-            <v:fill on="t" focussize="0,0"/>
-            <v:stroke on="f"/>
-            <v:imagedata o:title=""/>
-            <o:lock v:ext="edit"/>
-            <w10:wrap type="none"/>
-            <w10:anchorlock/>
-          </v:rect>
-        </w:pict>
-      </w:r>
-    </w:p>
-    <w:p>
-      <w:pPr>
-        <w:spacing w:after="0"/>
-        <w:rPr>
-          <w:b/>
-          <w:bCs/>
-          <w:sz w:val="18"/>
-          <w:szCs w:val="18"/>
-        </w:rPr>
-      </w:pPr>
-      <w:r>
-        <w:rPr>
-          <w:b/>
-          <w:bCs/>
-          <w:sz w:val="18"/>
-          <w:szCs w:val="18"/>
-        </w:rPr>
-        <w:t>5. Changes Made by Me</w:t>
-      </w:r>
-    </w:p>
-    <w:p>
-      <w:pPr>
-        <w:spacing w:after="0"/>
-        <w:rPr>
-          <w:sz w:val="18"/>
-          <w:szCs w:val="18"/>
-        </w:rPr>
-      </w:pPr>
-      <w:r>
-        <w:rPr>
-          <w:sz w:val="18"/>
-          <w:szCs w:val="18"/>
-        </w:rPr>
-        <w:t>Explain what you changed, modified, or improved in the AI-generated solution.</w:t>
-      </w:r>
-    </w:p>
-    <w:p>
-      <w:pPr>
-        <w:spacing w:after="0"/>
-        <w:rPr>
-          <w:sz w:val="18"/>
-          <w:szCs w:val="18"/>
-        </w:rPr>
-      </w:pPr>
-      <w:r>
-        <w:rPr>
-          <w:b/>
-          <w:bCs/>
-          <w:sz w:val="18"/>
-          <w:szCs w:val="18"/>
-        </w:rPr>
-        <w:t>Response:</w:t>
+          <w:rFonts w:hint="default" w:ascii="Arial" w:hAnsi="Arial" w:cs="Arial"/>
+          <w:sz w:val="18"/>
+          <w:szCs w:val="18"/>
+        </w:rPr>
+      </w:pPr>
+      <w:r>
+        <w:rPr>
+          <w:rFonts w:hint="default" w:ascii="Arial" w:hAnsi="Arial" w:cs="Arial"/>
+          <w:sz w:val="18"/>
+          <w:szCs w:val="18"/>
+        </w:rPr>
+        <w:t>Array methods: map builds the lists and chart data, filter handles search and the status filter, sort uses a lookup of comparator functions, and reduce computes the overall percentage and status counts.</w:t>
       </w:r>
     </w:p>
     <w:p>
       <w:pPr>
         <w:spacing w:after="60"/>
         <w:rPr>
-          <w:sz w:val="18"/>
-          <w:szCs w:val="18"/>
-        </w:rPr>
-      </w:pPr>
-      <w:r>
-        <w:rPr>
-          <w:sz w:val="18"/>
-          <w:szCs w:val="18"/>
-        </w:rPr>
-        <w:t xml:space="preserve">- Chose the problem to solve (attendance and alerts hub) from the options the AI proposed, and chose to use mock data instead of real student data.</w:t>
+          <w:rFonts w:hint="default" w:ascii="Arial" w:hAnsi="Arial" w:cs="Arial"/>
+          <w:sz w:val="18"/>
+          <w:szCs w:val="18"/>
+        </w:rPr>
+      </w:pPr>
+      <w:r>
+        <w:rPr>
+          <w:rFonts w:hint="default" w:ascii="Arial" w:hAnsi="Arial" w:cs="Arial"/>
+          <w:sz w:val="18"/>
+          <w:szCs w:val="18"/>
+        </w:rPr>
+        <w:t>Formulas: with t = 0.75, classes I can still miss = floor(attended / t - held), and classes I must attend in a row to recover = ceil((t x held - attended) / (1 - t)). Example: 18/25 is 72%, and attending 3 more gives 21/28 = 75%.</w:t>
       </w:r>
     </w:p>
     <w:p>
       <w:pPr>
         <w:spacing w:after="60"/>
         <w:rPr>
-          <w:sz w:val="18"/>
-          <w:szCs w:val="18"/>
-        </w:rPr>
-      </w:pPr>
-      <w:r>
-        <w:rPr>
-          <w:sz w:val="18"/>
-          <w:szCs w:val="18"/>
-        </w:rPr>
-        <w:t xml:space="preserve">- Chose the repository visibility (public) and that commits must be authored only under my own identity with no Claude co-author.</w:t>
-      </w:r>
-    </w:p>
-    <w:p>
-      <w:pPr>
-        <w:spacing w:after="60"/>
-        <w:rPr>
-          <w:sz w:val="18"/>
-          <w:szCs w:val="18"/>
-        </w:rPr>
-      </w:pPr>
-      <w:r>
-        <w:rPr>
-          <w:sz w:val="18"/>
-          <w:szCs w:val="18"/>
-        </w:rPr>
-        <w:t xml:space="preserve">- Reviewed the generated code and requirements against the assignment document, and corrected the AI's draft report (for example, the AI had not been given this template).</w:t>
-      </w:r>
-    </w:p>
-    <w:p>
-      <w:pPr>
-        <w:spacing w:after="60"/>
-        <w:rPr>
-          <w:sz w:val="18"/>
-          <w:szCs w:val="18"/>
-        </w:rPr>
-      </w:pPr>
-      <w:r>
-        <w:rPr>
-          <w:sz w:val="18"/>
-          <w:szCs w:val="18"/>
-        </w:rPr>
-        <w:t xml:space="preserve">- I did not hand-edit the generated source code beyond these decisions; the AI made the fixes it found during testing (listed in section 7).</w:t>
-      </w:r>
-    </w:p>
-    <w:p>
-      <w:pPr>
-        <w:spacing w:after="0"/>
-        <w:rPr>
-          <w:sz w:val="18"/>
-          <w:szCs w:val="18"/>
-        </w:rPr>
-      </w:pPr>
-      <w:r>
-        <w:rPr>
-          <w:sz w:val="18"/>
-          <w:szCs w:val="18"/>
-        </w:rPr>
-        <w:pict>
-          <v:rect id="_x0000_i1040" o:spt="1" style="height:1.5pt;width:0pt;" fillcolor="#A0A0A0" filled="t" stroked="f" coordsize="21600,21600" o:hr="t" o:hrstd="t" o:hralign="center">
-            <v:path/>
-            <v:fill on="t" focussize="0,0"/>
-            <v:stroke on="f"/>
-            <v:imagedata o:title=""/>
-            <o:lock v:ext="edit"/>
-            <w10:wrap type="none"/>
-            <w10:anchorlock/>
-          </v:rect>
-        </w:pict>
-      </w:r>
-    </w:p>
-    <w:p>
-      <w:pPr>
-        <w:spacing w:after="0"/>
-        <w:rPr>
-          <w:sz w:val="18"/>
-          <w:szCs w:val="18"/>
-        </w:rPr>
-      </w:pPr>
-      <w:r>
-        <w:rPr>
-          <w:sz w:val="18"/>
-          <w:szCs w:val="18"/>
-        </w:rPr>
-        <w:pict>
-          <v:rect id="_x0000_i1041" o:spt="1" style="height:1.5pt;width:0pt;" fillcolor="#A0A0A0" filled="t" stroked="f" coordsize="21600,21600" o:hr="t" o:hrstd="t" o:hralign="center">
-            <v:path/>
-            <v:fill on="t" focussize="0,0"/>
-            <v:stroke on="f"/>
-            <v:imagedata o:title=""/>
-            <o:lock v:ext="edit"/>
-            <w10:wrap type="none"/>
-            <w10:anchorlock/>
-          </v:rect>
-        </w:pict>
-      </w:r>
-    </w:p>
-    <w:p>
-      <w:pPr>
-        <w:spacing w:after="0"/>
-        <w:rPr>
-          <w:b/>
-          <w:bCs/>
-          <w:sz w:val="18"/>
-          <w:szCs w:val="18"/>
-        </w:rPr>
-      </w:pPr>
-      <w:r>
-        <w:rPr>
-          <w:b/>
-          <w:bCs/>
-          <w:sz w:val="18"/>
-          <w:szCs w:val="18"/>
-        </w:rPr>
-        <w:t>6. My Understanding</w:t>
-      </w:r>
-    </w:p>
-    <w:p>
-      <w:pPr>
-        <w:spacing w:after="0"/>
-        <w:rPr>
-          <w:sz w:val="18"/>
-          <w:szCs w:val="18"/>
-        </w:rPr>
-      </w:pPr>
-      <w:r>
-        <w:rPr>
-          <w:sz w:val="18"/>
-          <w:szCs w:val="18"/>
-        </w:rPr>
-        <w:t xml:space="preserve">Explain the important part(s) of the AI-generated code in your </w:t>
-      </w:r>
-      <w:r>
-        <w:rPr>
-          <w:b/>
-          <w:bCs/>
-          <w:sz w:val="18"/>
-          <w:szCs w:val="18"/>
-        </w:rPr>
-        <w:t>own words</w:t>
-      </w:r>
-      <w:r>
-        <w:rPr>
-          <w:sz w:val="18"/>
-          <w:szCs w:val="18"/>
-        </w:rPr>
-        <w:t>.</w:t>
-      </w:r>
-    </w:p>
-    <w:p>
-      <w:pPr>
-        <w:spacing w:after="0"/>
-        <w:rPr>
-          <w:sz w:val="18"/>
-          <w:szCs w:val="18"/>
-        </w:rPr>
-      </w:pPr>
-      <w:r>
-        <w:rPr>
-          <w:b/>
-          <w:bCs/>
-          <w:sz w:val="18"/>
-          <w:szCs w:val="18"/>
-        </w:rPr>
-        <w:t>Response:</w:t>
-      </w:r>
-    </w:p>
-    <w:p>
-      <w:pPr>
-        <w:spacing w:after="60"/>
-        <w:rPr>
-          <w:sz w:val="18"/>
-          <w:szCs w:val="18"/>
-        </w:rPr>
-      </w:pPr>
-      <w:r>
-        <w:rPr>
-          <w:sz w:val="18"/>
-          <w:szCs w:val="18"/>
-        </w:rPr>
-        <w:t xml:space="preserve">State: App.js keeps two pieces of state with useState: view (which screen is showing) and rawCourses (attended and held counts per course). Switching a screen just calls setView, and renderView() returns the matching component. This is how the assignment asks for navigation without a library.</w:t>
-      </w:r>
-    </w:p>
-    <w:p>
-      <w:pPr>
-        <w:spacing w:after="60"/>
-        <w:rPr>
-          <w:sz w:val="18"/>
-          <w:szCs w:val="18"/>
-        </w:rPr>
-      </w:pPr>
-      <w:r>
-        <w:rPr>
-          <w:sz w:val="18"/>
-          <w:szCs w:val="18"/>
-        </w:rPr>
-        <w:t xml:space="preserve">Derived data: percentage, status, canMiss and needed are not stored. withStats() recomputes them from attended and held every render, so marking a class present or absent updates the cards, alerts and charts together.</w:t>
-      </w:r>
-    </w:p>
-    <w:p>
-      <w:pPr>
-        <w:spacing w:after="60"/>
-        <w:rPr>
-          <w:sz w:val="18"/>
-          <w:szCs w:val="18"/>
-        </w:rPr>
-      </w:pPr>
-      <w:r>
-        <w:rPr>
-          <w:sz w:val="18"/>
-          <w:szCs w:val="18"/>
-        </w:rPr>
-        <w:t xml:space="preserve">Props: screens receive courses and callbacks (onBack, onMark, onAdd, onOpenCourse) as props, and reusable components such as CourseCard and FormField only receive the data they display.</w:t>
-      </w:r>
-    </w:p>
-    <w:p>
-      <w:pPr>
-        <w:spacing w:after="60"/>
-        <w:rPr>
-          <w:sz w:val="18"/>
-          <w:szCs w:val="18"/>
-        </w:rPr>
-      </w:pPr>
-      <w:r>
-        <w:rPr>
-          <w:sz w:val="18"/>
-          <w:szCs w:val="18"/>
-        </w:rPr>
-        <w:t xml:space="preserve">Array methods: map builds the lists and chart data, filter handles search and the status filter, sort uses a lookup of comparator functions, and reduce computes the overall percentage and status counts.</w:t>
-      </w:r>
-    </w:p>
-    <w:p>
-      <w:pPr>
-        <w:spacing w:after="60"/>
-        <w:rPr>
-          <w:sz w:val="18"/>
-          <w:szCs w:val="18"/>
-        </w:rPr>
-      </w:pPr>
-      <w:r>
-        <w:rPr>
-          <w:sz w:val="18"/>
-          <w:szCs w:val="18"/>
-        </w:rPr>
-        <w:t xml:space="preserve">Formulas: with t = 0.75, classes I can still miss = floor(attended / t - held), and classes I must attend in a row to recover = ceil((t x held - attended) / (1 - t)). Example: 18/25 is 72%, and attending 3 more gives 21/28 = 75%.</w:t>
-      </w:r>
-    </w:p>
-    <w:p>
-      <w:pPr>
-        <w:spacing w:after="60"/>
-        <w:rPr>
-          <w:sz w:val="18"/>
-          <w:szCs w:val="18"/>
-        </w:rPr>
-      </w:pPr>
-      <w:r>
-        <w:rPr>
-          <w:sz w:val="18"/>
-          <w:szCs w:val="18"/>
-        </w:rPr>
-        <w:t xml:space="preserve">Conditional rendering: empty-list states, the colour and badge per status, alerts that only appear for non-safe courses, and form error messages that only appear when a field is invalid.</w:t>
-      </w:r>
-    </w:p>
-    <w:p>
-      <w:pPr>
-        <w:spacing w:after="0"/>
-        <w:rPr>
-          <w:sz w:val="18"/>
-          <w:szCs w:val="18"/>
-        </w:rPr>
-      </w:pPr>
-      <w:r>
-        <w:rPr>
-          <w:sz w:val="18"/>
-          <w:szCs w:val="18"/>
-        </w:rPr>
-        <w:pict>
-          <v:rect id="_x0000_i1043" o:spt="1" style="height:1.5pt;width:0pt;" fillcolor="#A0A0A0" filled="t" stroked="f" coordsize="21600,21600" o:hr="t" o:hrstd="t" o:hralign="center">
-            <v:path/>
-            <v:fill on="t" focussize="0,0"/>
-            <v:stroke on="f"/>
-            <v:imagedata o:title=""/>
-            <o:lock v:ext="edit"/>
-            <w10:wrap type="none"/>
-            <w10:anchorlock/>
-          </v:rect>
-        </w:pict>
-      </w:r>
-    </w:p>
-    <w:p>
-      <w:pPr>
-        <w:spacing w:after="0"/>
-        <w:rPr>
-          <w:sz w:val="18"/>
-          <w:szCs w:val="18"/>
-        </w:rPr>
-      </w:pPr>
-      <w:r>
-        <w:rPr>
-          <w:sz w:val="18"/>
-          <w:szCs w:val="18"/>
-        </w:rPr>
-        <w:pict>
-          <v:rect id="_x0000_i1044" o:spt="1" style="height:1.5pt;width:0pt;" fillcolor="#A0A0A0" filled="t" stroked="f" coordsize="21600,21600" o:hr="t" o:hrstd="t" o:hralign="center">
-            <v:path/>
-            <v:fill on="t" focussize="0,0"/>
-            <v:stroke on="f"/>
-            <v:imagedata o:title=""/>
-            <o:lock v:ext="edit"/>
-            <w10:wrap type="none"/>
-            <w10:anchorlock/>
-          </v:rect>
-        </w:pict>
-      </w:r>
-    </w:p>
-    <w:p>
-      <w:pPr>
-        <w:spacing w:after="0"/>
-        <w:rPr>
-          <w:b/>
-          <w:bCs/>
-          <w:sz w:val="18"/>
-          <w:szCs w:val="18"/>
-        </w:rPr>
-      </w:pPr>
-      <w:r>
-        <w:rPr>
+          <w:rFonts w:hint="default" w:ascii="Arial" w:hAnsi="Arial" w:cs="Arial"/>
+          <w:sz w:val="18"/>
+          <w:szCs w:val="18"/>
+        </w:rPr>
+      </w:pPr>
+      <w:r>
+        <w:rPr>
+          <w:rFonts w:hint="default" w:ascii="Arial" w:hAnsi="Arial" w:cs="Arial"/>
+          <w:sz w:val="18"/>
+          <w:szCs w:val="18"/>
+        </w:rPr>
+        <w:t>Conditional rendering: empty-list states, the colour and badge per status, alerts that only appear for non-safe courses, and form error messages that only appear when a field is invalid.</w:t>
+      </w:r>
+    </w:p>
+    <w:p>
+      <w:pPr>
+        <w:spacing w:after="0"/>
+        <w:rPr>
+          <w:rFonts w:hint="default" w:ascii="Arial" w:hAnsi="Arial" w:cs="Arial"/>
+          <w:b/>
+          <w:bCs/>
+          <w:sz w:val="18"/>
+          <w:szCs w:val="18"/>
+        </w:rPr>
+      </w:pPr>
+      <w:r>
+        <w:rPr>
+          <w:rFonts w:hint="default" w:ascii="Arial" w:hAnsi="Arial" w:cs="Arial"/>
           <w:b/>
           <w:bCs/>
           <w:sz w:val="18"/>
@@ -1258,12 +1038,14 @@
       <w:pPr>
         <w:spacing w:after="0"/>
         <w:rPr>
-          <w:sz w:val="18"/>
-          <w:szCs w:val="18"/>
-        </w:rPr>
-      </w:pPr>
-      <w:r>
-        <w:rPr>
+          <w:rFonts w:hint="default" w:ascii="Arial" w:hAnsi="Arial" w:cs="Arial"/>
+          <w:sz w:val="18"/>
+          <w:szCs w:val="18"/>
+        </w:rPr>
+      </w:pPr>
+      <w:r>
+        <w:rPr>
+          <w:rFonts w:hint="default" w:ascii="Arial" w:hAnsi="Arial" w:cs="Arial"/>
           <w:sz w:val="18"/>
           <w:szCs w:val="18"/>
         </w:rPr>
@@ -1274,12 +1056,14 @@
       <w:pPr>
         <w:spacing w:after="0"/>
         <w:rPr>
-          <w:sz w:val="18"/>
-          <w:szCs w:val="18"/>
-        </w:rPr>
-      </w:pPr>
-      <w:r>
-        <w:rPr>
+          <w:rFonts w:hint="default" w:ascii="Arial" w:hAnsi="Arial" w:cs="Arial"/>
+          <w:sz w:val="18"/>
+          <w:szCs w:val="18"/>
+        </w:rPr>
+      </w:pPr>
+      <w:r>
+        <w:rPr>
+          <w:rFonts w:hint="default" w:ascii="Arial" w:hAnsi="Arial" w:cs="Arial"/>
           <w:sz w:val="18"/>
           <w:szCs w:val="18"/>
         </w:rPr>
@@ -1294,12 +1078,14 @@
         </w:numPr>
         <w:spacing w:after="0"/>
         <w:rPr>
-          <w:sz w:val="18"/>
-          <w:szCs w:val="18"/>
-        </w:rPr>
-      </w:pPr>
-      <w:r>
-        <w:rPr>
+          <w:rFonts w:hint="default" w:ascii="Arial" w:hAnsi="Arial" w:cs="Arial"/>
+          <w:sz w:val="18"/>
+          <w:szCs w:val="18"/>
+        </w:rPr>
+      </w:pPr>
+      <w:r>
+        <w:rPr>
+          <w:rFonts w:hint="default" w:ascii="Arial" w:hAnsi="Arial" w:cs="Arial"/>
           <w:sz w:val="18"/>
           <w:szCs w:val="18"/>
         </w:rPr>
@@ -1314,12 +1100,14 @@
         </w:numPr>
         <w:spacing w:after="0"/>
         <w:rPr>
-          <w:sz w:val="18"/>
-          <w:szCs w:val="18"/>
-        </w:rPr>
-      </w:pPr>
-      <w:r>
-        <w:rPr>
+          <w:rFonts w:hint="default" w:ascii="Arial" w:hAnsi="Arial" w:cs="Arial"/>
+          <w:sz w:val="18"/>
+          <w:szCs w:val="18"/>
+        </w:rPr>
+      </w:pPr>
+      <w:r>
+        <w:rPr>
+          <w:rFonts w:hint="default" w:ascii="Arial" w:hAnsi="Arial" w:cs="Arial"/>
           <w:sz w:val="18"/>
           <w:szCs w:val="18"/>
         </w:rPr>
@@ -1334,12 +1122,14 @@
         </w:numPr>
         <w:spacing w:after="0"/>
         <w:rPr>
-          <w:sz w:val="18"/>
-          <w:szCs w:val="18"/>
-        </w:rPr>
-      </w:pPr>
-      <w:r>
-        <w:rPr>
+          <w:rFonts w:hint="default" w:ascii="Arial" w:hAnsi="Arial" w:cs="Arial"/>
+          <w:sz w:val="18"/>
+          <w:szCs w:val="18"/>
+        </w:rPr>
+      </w:pPr>
+      <w:r>
+        <w:rPr>
+          <w:rFonts w:hint="default" w:ascii="Arial" w:hAnsi="Arial" w:cs="Arial"/>
           <w:sz w:val="18"/>
           <w:szCs w:val="18"/>
         </w:rPr>
@@ -1354,12 +1144,14 @@
         </w:numPr>
         <w:spacing w:after="0"/>
         <w:rPr>
-          <w:sz w:val="18"/>
-          <w:szCs w:val="18"/>
-        </w:rPr>
-      </w:pPr>
-      <w:r>
-        <w:rPr>
+          <w:rFonts w:hint="default" w:ascii="Arial" w:hAnsi="Arial" w:cs="Arial"/>
+          <w:sz w:val="18"/>
+          <w:szCs w:val="18"/>
+        </w:rPr>
+      </w:pPr>
+      <w:r>
+        <w:rPr>
+          <w:rFonts w:hint="default" w:ascii="Arial" w:hAnsi="Arial" w:cs="Arial"/>
           <w:sz w:val="18"/>
           <w:szCs w:val="18"/>
         </w:rPr>
@@ -1370,12 +1162,14 @@
       <w:pPr>
         <w:spacing w:after="0"/>
         <w:rPr>
-          <w:sz w:val="18"/>
-          <w:szCs w:val="18"/>
-        </w:rPr>
-      </w:pPr>
-      <w:r>
-        <w:rPr>
+          <w:rFonts w:hint="default" w:ascii="Arial" w:hAnsi="Arial" w:cs="Arial"/>
+          <w:sz w:val="18"/>
+          <w:szCs w:val="18"/>
+        </w:rPr>
+      </w:pPr>
+      <w:r>
+        <w:rPr>
+          <w:rFonts w:hint="default" w:ascii="Arial" w:hAnsi="Arial" w:cs="Arial"/>
           <w:b/>
           <w:bCs/>
           <w:sz w:val="18"/>
@@ -1388,130 +1182,88 @@
       <w:pPr>
         <w:spacing w:after="60"/>
         <w:rPr>
-          <w:sz w:val="18"/>
-          <w:szCs w:val="18"/>
-        </w:rPr>
-      </w:pPr>
-      <w:r>
-        <w:rPr>
-          <w:sz w:val="18"/>
-          <w:szCs w:val="18"/>
-        </w:rPr>
-        <w:t xml:space="preserve">Did it work: yes. I ran the app as a web build in a phone-sized browser window (390 x 844) and exercised every screen: dashboard charts, search, filters, sorting, marking present three times on Operating Systems (15/22 became 18/25 = 72%, and the advice matched the formula), the Alerts list, form validation with all fields empty, and adding a valid course (list changed to 7 of 7 courses). Screenshots of each step are in the repo.</w:t>
+          <w:rFonts w:hint="default" w:ascii="Arial" w:hAnsi="Arial" w:cs="Arial"/>
+          <w:sz w:val="18"/>
+          <w:szCs w:val="18"/>
+        </w:rPr>
+      </w:pPr>
+      <w:r>
+        <w:rPr>
+          <w:rFonts w:hint="default" w:ascii="Arial" w:hAnsi="Arial" w:cs="Arial"/>
+          <w:sz w:val="18"/>
+          <w:szCs w:val="18"/>
+        </w:rPr>
+        <w:t>Did it work: yes. I ran the app as a web build in a phone-sized browser window (390 x 844) and exercised every screen: dashboard charts, search, filters, sorting, marking present three times on Operating Systems (15/22 became 18/25 = 72%, and the advice matched the formula), the Alerts list, form validation with all fields empty, and adding a valid course (list changed to 7 of 7 courses). Screenshots of each step are in the repo.</w:t>
       </w:r>
     </w:p>
     <w:p>
       <w:pPr>
         <w:spacing w:after="60"/>
         <w:rPr>
-          <w:sz w:val="18"/>
-          <w:szCs w:val="18"/>
-        </w:rPr>
-      </w:pPr>
-      <w:r>
-        <w:rPr>
-          <w:sz w:val="18"/>
-          <w:szCs w:val="18"/>
-        </w:rPr>
-        <w:t xml:space="preserve">Errors found: (1) the bar chart labels showed only 3009 instead of CS3009; (2) the first screenshot attempt of the form never showed the validation errors because the test script clicked the page title instead of the button (test script problem, not an app bug); (3) on web the console prints react-native-chart-kit warnings about SVG props, which do not occur on a device.</w:t>
+          <w:rFonts w:hint="default" w:ascii="Arial" w:hAnsi="Arial" w:cs="Arial"/>
+          <w:sz w:val="18"/>
+          <w:szCs w:val="18"/>
+        </w:rPr>
+      </w:pPr>
+      <w:r>
+        <w:rPr>
+          <w:rFonts w:hint="default" w:ascii="Arial" w:hAnsi="Arial" w:cs="Arial"/>
+          <w:sz w:val="18"/>
+          <w:szCs w:val="18"/>
+        </w:rPr>
+        <w:t>Errors found: (1) the bar chart labels showed only 3009 instead of CS3009; (2) the first screenshot attempt of the form never showed the validation errors because the test script clicked the page title instead of the button (test script problem, not an app bug); (3) on web the console prints react-native-chart-kit warnings about SVG props, which do not occur on a device.</w:t>
       </w:r>
     </w:p>
     <w:p>
       <w:pPr>
         <w:spacing w:after="60"/>
         <w:rPr>
-          <w:sz w:val="18"/>
-          <w:szCs w:val="18"/>
-        </w:rPr>
-      </w:pPr>
-      <w:r>
-        <w:rPr>
-          <w:sz w:val="18"/>
-          <w:szCs w:val="18"/>
-        </w:rPr>
-        <w:t xml:space="preserve">Fixes: the chart labels now use the full course code, and the script was changed to click the exact button text; the chart-kit warnings are harmless and were left as they are.</w:t>
+          <w:rFonts w:hint="default" w:ascii="Arial" w:hAnsi="Arial" w:cs="Arial"/>
+          <w:sz w:val="18"/>
+          <w:szCs w:val="18"/>
+        </w:rPr>
+      </w:pPr>
+      <w:r>
+        <w:rPr>
+          <w:rFonts w:hint="default" w:ascii="Arial" w:hAnsi="Arial" w:cs="Arial"/>
+          <w:sz w:val="18"/>
+          <w:szCs w:val="18"/>
+        </w:rPr>
+        <w:t>Fixes: the chart labels now use the full course code, and the script was changed to click the exact button text; the chart-kit warnings are harmless and were left as they are.</w:t>
       </w:r>
     </w:p>
     <w:p>
       <w:pPr>
         <w:spacing w:after="60"/>
         <w:rPr>
-          <w:sz w:val="18"/>
-          <w:szCs w:val="18"/>
-        </w:rPr>
-      </w:pPr>
-      <w:r>
-        <w:rPr>
-          <w:sz w:val="18"/>
-          <w:szCs w:val="18"/>
-        </w:rPr>
-        <w:t xml:space="preserve">Not done: I have not yet tested on a physical phone or an Android emulator.</w:t>
-      </w:r>
-    </w:p>
-    <w:p>
-      <w:pPr>
-        <w:spacing w:after="0"/>
-        <w:rPr>
-          <w:sz w:val="18"/>
-          <w:szCs w:val="18"/>
-        </w:rPr>
-      </w:pPr>
-      <w:r>
-        <w:rPr>
-          <w:sz w:val="18"/>
-          <w:szCs w:val="18"/>
-        </w:rPr>
-        <w:pict>
-          <v:rect id="_x0000_i1046" o:spt="1" style="height:1.5pt;width:0pt;" fillcolor="#A0A0A0" filled="t" stroked="f" coordsize="21600,21600" o:hr="t" o:hrstd="t" o:hralign="center">
-            <v:path/>
-            <v:fill on="t" focussize="0,0"/>
-            <v:stroke on="f"/>
-            <v:imagedata o:title=""/>
-            <o:lock v:ext="edit"/>
-            <w10:wrap type="none"/>
-            <w10:anchorlock/>
-          </v:rect>
-        </w:pict>
-      </w:r>
-    </w:p>
-    <w:p>
-      <w:pPr>
-        <w:spacing w:after="0"/>
-        <w:rPr>
-          <w:sz w:val="18"/>
-          <w:szCs w:val="18"/>
-        </w:rPr>
-      </w:pPr>
-      <w:r>
-        <w:rPr>
-          <w:sz w:val="18"/>
-          <w:szCs w:val="18"/>
-        </w:rPr>
-        <w:pict>
-          <v:rect id="_x0000_i1047" o:spt="1" style="height:1.5pt;width:0pt;" fillcolor="#A0A0A0" filled="t" stroked="f" coordsize="21600,21600" o:hr="t" o:hrstd="t" o:hralign="center">
-            <v:path/>
-            <v:fill on="t" focussize="0,0"/>
-            <v:stroke on="f"/>
-            <v:imagedata o:title=""/>
-            <o:lock v:ext="edit"/>
-            <w10:wrap type="none"/>
-            <w10:anchorlock/>
-          </v:rect>
-        </w:pict>
-      </w:r>
-    </w:p>
-    <w:p>
-      <w:pPr>
-        <w:spacing w:after="0"/>
-        <w:rPr>
-          <w:b/>
-          <w:bCs/>
-          <w:sz w:val="18"/>
-          <w:szCs w:val="18"/>
-        </w:rPr>
-      </w:pPr>
-      <w:r>
-        <w:rPr>
+          <w:rFonts w:hint="default" w:ascii="Arial" w:hAnsi="Arial" w:cs="Arial"/>
+          <w:sz w:val="18"/>
+          <w:szCs w:val="18"/>
+        </w:rPr>
+      </w:pPr>
+      <w:r>
+        <w:rPr>
+          <w:rFonts w:hint="default" w:ascii="Arial" w:hAnsi="Arial" w:cs="Arial"/>
+          <w:sz w:val="18"/>
+          <w:szCs w:val="18"/>
+        </w:rPr>
+        <w:t>Not done: I have not yet tested on a physical phone.</w:t>
+      </w:r>
+    </w:p>
+    <w:p>
+      <w:pPr>
+        <w:spacing w:after="0"/>
+        <w:rPr>
+          <w:rFonts w:hint="default" w:ascii="Arial" w:hAnsi="Arial" w:cs="Arial"/>
+          <w:b/>
+          <w:bCs/>
+          <w:sz w:val="18"/>
+          <w:szCs w:val="18"/>
+        </w:rPr>
+      </w:pPr>
+      <w:r>
+        <w:rPr>
+          <w:rFonts w:hint="default" w:ascii="Arial" w:hAnsi="Arial" w:cs="Arial"/>
           <w:b/>
           <w:bCs/>
           <w:sz w:val="18"/>
@@ -1524,12 +1276,14 @@
       <w:pPr>
         <w:spacing w:after="0"/>
         <w:rPr>
-          <w:sz w:val="18"/>
-          <w:szCs w:val="18"/>
-        </w:rPr>
-      </w:pPr>
-      <w:r>
-        <w:rPr>
+          <w:rFonts w:hint="default" w:ascii="Arial" w:hAnsi="Arial" w:cs="Arial"/>
+          <w:sz w:val="18"/>
+          <w:szCs w:val="18"/>
+        </w:rPr>
+      </w:pPr>
+      <w:r>
+        <w:rPr>
+          <w:rFonts w:hint="default" w:ascii="Arial" w:hAnsi="Arial" w:cs="Arial"/>
           <w:sz w:val="18"/>
           <w:szCs w:val="18"/>
         </w:rPr>
@@ -1540,12 +1294,14 @@
       <w:pPr>
         <w:spacing w:after="0"/>
         <w:rPr>
-          <w:sz w:val="18"/>
-          <w:szCs w:val="18"/>
-        </w:rPr>
-      </w:pPr>
-      <w:r>
-        <w:rPr>
+          <w:rFonts w:hint="default" w:ascii="Arial" w:hAnsi="Arial" w:cs="Arial"/>
+          <w:sz w:val="18"/>
+          <w:szCs w:val="18"/>
+        </w:rPr>
+      </w:pPr>
+      <w:r>
+        <w:rPr>
+          <w:rFonts w:hint="default" w:ascii="Arial" w:hAnsi="Arial" w:cs="Arial"/>
           <w:b/>
           <w:bCs/>
           <w:sz w:val="18"/>
@@ -1558,82 +1314,36 @@
       <w:pPr>
         <w:spacing w:after="60"/>
         <w:rPr>
-          <w:sz w:val="18"/>
-          <w:szCs w:val="18"/>
-        </w:rPr>
-      </w:pPr>
-      <w:r>
-        <w:rPr>
-          <w:sz w:val="18"/>
-          <w:szCs w:val="18"/>
-        </w:rPr>
-        <w:t xml:space="preserve">I learned how to structure a small React Native app so that data, logic and UI are separate: raw data in state, calculations in a utility file, and small reusable components. I saw that derived values (percentage, status) are better computed than stored, because then one state change updates the whole UI. I also learned that AI output needs checking against the assignment rules, for example no navigation library, and that I must test it myself, since the AI's first screenshot attempt missed the validation state and its draft report did not match the real template. I will use the code to prepare for the viva by practising small changes such as changing the threshold or adding a course.</w:t>
-      </w:r>
-    </w:p>
-    <w:p>
-      <w:pPr>
-        <w:spacing w:after="0"/>
-        <w:rPr>
-          <w:sz w:val="18"/>
-          <w:szCs w:val="18"/>
-        </w:rPr>
-      </w:pPr>
-      <w:r>
-        <w:rPr>
-          <w:sz w:val="18"/>
-          <w:szCs w:val="18"/>
-        </w:rPr>
-        <w:pict>
-          <v:rect id="_x0000_i1049" o:spt="1" style="height:1.5pt;width:0pt;" fillcolor="#A0A0A0" filled="t" stroked="f" coordsize="21600,21600" o:hr="t" o:hrstd="t" o:hralign="center">
-            <v:path/>
-            <v:fill on="t" focussize="0,0"/>
-            <v:stroke on="f"/>
-            <v:imagedata o:title=""/>
-            <o:lock v:ext="edit"/>
-            <w10:wrap type="none"/>
-            <w10:anchorlock/>
-          </v:rect>
-        </w:pict>
-      </w:r>
-    </w:p>
-    <w:p>
-      <w:pPr>
-        <w:spacing w:after="0"/>
-        <w:rPr>
-          <w:sz w:val="18"/>
-          <w:szCs w:val="18"/>
-        </w:rPr>
-      </w:pPr>
-      <w:r>
-        <w:rPr>
-          <w:sz w:val="18"/>
-          <w:szCs w:val="18"/>
-        </w:rPr>
-        <w:pict>
-          <v:rect id="_x0000_i1050" o:spt="1" style="height:1.5pt;width:0pt;" fillcolor="#A0A0A0" filled="t" stroked="f" coordsize="21600,21600" o:hr="t" o:hrstd="t" o:hralign="center">
-            <v:path/>
-            <v:fill on="t" focussize="0,0"/>
-            <v:stroke on="f"/>
-            <v:imagedata o:title=""/>
-            <o:lock v:ext="edit"/>
-            <w10:wrap type="none"/>
-            <w10:anchorlock/>
-          </v:rect>
-        </w:pict>
-      </w:r>
-    </w:p>
-    <w:p>
-      <w:pPr>
-        <w:spacing w:after="0"/>
-        <w:rPr>
-          <w:b/>
-          <w:bCs/>
-          <w:sz w:val="18"/>
-          <w:szCs w:val="18"/>
-        </w:rPr>
-      </w:pPr>
-      <w:r>
-        <w:rPr>
+          <w:rFonts w:hint="default" w:ascii="Arial" w:hAnsi="Arial" w:cs="Arial"/>
+          <w:sz w:val="18"/>
+          <w:szCs w:val="18"/>
+        </w:rPr>
+      </w:pPr>
+      <w:r>
+        <w:rPr>
+          <w:rFonts w:hint="default" w:ascii="Arial" w:hAnsi="Arial" w:cs="Arial"/>
+          <w:sz w:val="18"/>
+          <w:szCs w:val="18"/>
+        </w:rPr>
+        <w:t>I learned how to structure a small React Native app so that data, logic and UI are separate: raw data in state, calculations in a utility file, and small reusable components. I saw that derived values (percentage, status) are better computed than stored, because then one state change updates the whole UI. I also learned that AI output needs checking against the assignment rules, for example no navigation library, and that I must test it myself, since the AI's first screenshot attempt missed the validation state and its draft report did not match the real template. I will use the code to prepare for the viva by practising small changes such as changing the threshold or adding a course.</w:t>
+      </w:r>
+    </w:p>
+    <w:p>
+      <w:pPr>
+        <w:spacing w:after="0"/>
+        <w:rPr>
+          <w:rFonts w:hint="default" w:ascii="Arial" w:hAnsi="Arial" w:cs="Arial"/>
+          <w:b/>
+          <w:bCs/>
+          <w:sz w:val="18"/>
+          <w:szCs w:val="18"/>
+        </w:rPr>
+      </w:pPr>
+      <w:bookmarkStart w:id="0" w:name="_GoBack"/>
+      <w:bookmarkEnd w:id="0"/>
+      <w:r>
+        <w:rPr>
+          <w:rFonts w:hint="default" w:ascii="Arial" w:hAnsi="Arial" w:cs="Arial"/>
           <w:b/>
           <w:bCs/>
           <w:sz w:val="18"/>
@@ -1646,12 +1356,14 @@
       <w:pPr>
         <w:spacing w:after="0"/>
         <w:rPr>
-          <w:sz w:val="18"/>
-          <w:szCs w:val="18"/>
-        </w:rPr>
-      </w:pPr>
-      <w:r>
-        <w:rPr>
+          <w:rFonts w:hint="default" w:ascii="Arial" w:hAnsi="Arial" w:cs="Arial"/>
+          <w:sz w:val="18"/>
+          <w:szCs w:val="18"/>
+        </w:rPr>
+      </w:pPr>
+      <w:r>
+        <w:rPr>
+          <w:rFonts w:hint="default" w:ascii="Arial" w:hAnsi="Arial" w:cs="Arial"/>
           <w:sz w:val="18"/>
           <w:szCs w:val="18"/>
         </w:rPr>
@@ -1662,7 +1374,7 @@
       <w:pPr>
         <w:spacing w:after="0"/>
         <w:rPr>
-          <w:rFonts w:hint="default"/>
+          <w:rFonts w:hint="default" w:ascii="Arial" w:hAnsi="Arial" w:cs="Arial"/>
           <w:sz w:val="18"/>
           <w:szCs w:val="18"/>
           <w:lang w:val="en-US"/>
@@ -1670,6 +1382,7 @@
       </w:pPr>
       <w:r>
         <w:rPr>
+          <w:rFonts w:hint="default" w:ascii="Arial" w:hAnsi="Arial" w:cs="Arial"/>
           <w:b/>
           <w:bCs/>
           <w:sz w:val="18"/>
@@ -1679,6 +1392,7 @@
       </w:r>
       <w:r>
         <w:rPr>
+          <w:rFonts w:hint="default" w:ascii="Arial" w:hAnsi="Arial" w:cs="Arial"/>
           <w:sz w:val="18"/>
           <w:szCs w:val="18"/>
         </w:rPr>
@@ -1686,7 +1400,7 @@
       </w:r>
       <w:r>
         <w:rPr>
-          <w:rFonts w:hint="default"/>
+          <w:rFonts w:hint="default" w:ascii="Arial" w:hAnsi="Arial" w:cs="Arial"/>
           <w:sz w:val="18"/>
           <w:szCs w:val="18"/>
           <w:lang w:val="en-US"/>
@@ -1698,12 +1412,14 @@
       <w:pPr>
         <w:spacing w:after="0"/>
         <w:rPr>
-          <w:sz w:val="18"/>
-          <w:szCs w:val="18"/>
-        </w:rPr>
-      </w:pPr>
-      <w:r>
-        <w:rPr>
+          <w:rFonts w:hint="default" w:ascii="Arial" w:hAnsi="Arial" w:cs="Arial"/>
+          <w:sz w:val="18"/>
+          <w:szCs w:val="18"/>
+        </w:rPr>
+      </w:pPr>
+      <w:r>
+        <w:rPr>
+          <w:rFonts w:hint="default" w:ascii="Arial" w:hAnsi="Arial" w:cs="Arial"/>
           <w:b/>
           <w:bCs/>
           <w:sz w:val="18"/>
@@ -1713,6 +1429,7 @@
       </w:r>
       <w:r>
         <w:rPr>
+          <w:rFonts w:hint="default" w:ascii="Arial" w:hAnsi="Arial" w:cs="Arial"/>
           <w:sz w:val="18"/>
           <w:szCs w:val="18"/>
         </w:rPr>
@@ -1723,7 +1440,7 @@
       <w:pPr>
         <w:spacing w:after="0"/>
         <w:rPr>
-          <w:rFonts w:hint="default"/>
+          <w:rFonts w:hint="default" w:ascii="Arial" w:hAnsi="Arial" w:cs="Arial"/>
           <w:sz w:val="18"/>
           <w:szCs w:val="18"/>
           <w:lang w:val="en-US"/>
@@ -1731,6 +1448,7 @@
       </w:pPr>
       <w:r>
         <w:rPr>
+          <w:rFonts w:hint="default" w:ascii="Arial" w:hAnsi="Arial" w:cs="Arial"/>
           <w:b/>
           <w:bCs/>
           <w:sz w:val="18"/>
@@ -1740,6 +1458,7 @@
       </w:r>
       <w:r>
         <w:rPr>
+          <w:rFonts w:hint="default" w:ascii="Arial" w:hAnsi="Arial" w:cs="Arial"/>
           <w:sz w:val="18"/>
           <w:szCs w:val="18"/>
         </w:rPr>
@@ -1747,7 +1466,7 @@
       </w:r>
       <w:r>
         <w:rPr>
-          <w:rFonts w:hint="default"/>
+          <w:rFonts w:hint="default" w:ascii="Arial" w:hAnsi="Arial" w:cs="Arial"/>
           <w:sz w:val="18"/>
           <w:szCs w:val="18"/>
           <w:lang w:val="en-US"/>
@@ -1759,6 +1478,7 @@
       <w:pPr>
         <w:spacing w:after="0"/>
         <w:rPr>
+          <w:rFonts w:hint="default" w:ascii="Arial" w:hAnsi="Arial" w:cs="Arial"/>
           <w:sz w:val="18"/>
           <w:szCs w:val="18"/>
         </w:rPr>
@@ -2001,7 +1721,7 @@
   <w:docDefaults>
     <w:rPrDefault>
       <w:rPr>
-        <w:rFonts w:asciiTheme="minorHAnsi" w:hAnsiTheme="minorHAnsi" w:eastAsiaTheme="minorHAnsi" w:cstheme="minorBidi"/>
+        <w:rFonts w:ascii="Times New Roman" w:hAnsi="Times New Roman" w:eastAsia="SimSun" w:cs="Times New Roman"/>
       </w:rPr>
     </w:rPrDefault>
     <w:pPrDefault/>
@@ -2578,6 +2298,7 @@
     <w:basedOn w:val="11"/>
     <w:link w:val="3"/>
     <w:semiHidden/>
+    <w:qFormat/>
     <w:uiPriority w:val="9"/>
     <w:rPr>
       <w:rFonts w:asciiTheme="majorHAnsi" w:hAnsiTheme="majorHAnsi" w:eastAsiaTheme="majorEastAsia" w:cstheme="majorBidi"/>
@@ -2630,6 +2351,7 @@
     <w:basedOn w:val="11"/>
     <w:link w:val="7"/>
     <w:semiHidden/>
+    <w:qFormat/>
     <w:uiPriority w:val="9"/>
     <w:rPr>
       <w:rFonts w:eastAsiaTheme="majorEastAsia" w:cstheme="majorBidi"/>
@@ -2726,6 +2448,7 @@
     <w:name w:val="Subtitle Char"/>
     <w:basedOn w:val="11"/>
     <w:link w:val="13"/>
+    <w:qFormat/>
     <w:uiPriority w:val="11"/>
     <w:rPr>
       <w:rFonts w:eastAsiaTheme="majorEastAsia" w:cstheme="majorBidi"/>
@@ -2835,6 +2558,7 @@
     <w:name w:val="Intense Quote Char"/>
     <w:basedOn w:val="11"/>
     <w:link w:val="30"/>
+    <w:qFormat/>
     <w:uiPriority w:val="30"/>
     <w:rPr>
       <w:i/>

</xml_diff>